<commit_message>
docs(reviewers): bump reviewer template to v1.2 — drop 6-Likert-scale wording from Section 7 step 3
Session 35 (baaa7e7) removed all 6 Likert scales from the reviewer
form. The reviewer template's Section 7 step 3 still listed them
by name. 5-line edit + regenerator re-run aligns the template with
the post-Session-35 form.

Footer line bumped v1.1 -> v1.2. Sections 1-6 unchanged.
</commit_message>
<xml_diff>
--- a/public/downloads/oscrsj-reviewer-template.docx
+++ b/public/downloads/oscrsj-reviewer-template.docx
@@ -2208,7 +2208,7 @@
           <w:color w:val="120D08"/>
           <w:sz w:val="20"/>
         </w:rPr>
-        <w:t>Set the six rating scales on the form (Manuscript Quality, Novelty &amp; Significance, Scientific Rigor &amp; Methods, Data Quality &amp; Results, Clarity &amp; Presentation, and Compliance with Journal Scope), select your recommendation, and complete the conflict-of-interest declaration.</w:t>
+        <w:t>Select your recommendation and complete the conflict-of-interest declaration in the form fields. (The form does not collect Likert rating scales — your recommendation plus the freeform Feedback and review carry your assessment.)</w:t>
       </w:r>
     </w:p>
     <w:p>
@@ -2289,7 +2289,7 @@
           <w:color w:val="997E67"/>
           <w:sz w:val="18"/>
         </w:rPr>
-        <w:t>Reviewer Template v1.1  ·  Issued April 2026</w:t>
+        <w:t>Reviewer Template v1.2  ·  Issued April 2026</w:t>
       </w:r>
     </w:p>
     <w:sectPr>

</xml_diff>